<commit_message>
Document and refine pellicle scoring
</commit_message>
<xml_diff>
--- a/🧪 PRD pro Kombuchu.docx
+++ b/🧪 PRD pro Kombuchu.docx
@@ -8538,6 +8538,212 @@
       </w:r>
     </w:p>
     <w:p/>
+    <w:p>
+      <w:pPr>
+        <w:pStyle w:val="Heading1"/>
+      </w:pPr>
+      <w:r>
+        <w:t xml:space="preserve">19. Orientační gramáže placky / pellicle</w:t>
+      </w:r>
+    </w:p>
+    <w:p>
+      <w:pPr/>
+      <w:r>
+        <w:t xml:space="preserve">Gramáž placky se bere jako orientační mokrá váha po krátkém okapání. Nejde o přesnou biologickou sílu, protože dvě stejně velké placky mohou mít různou tloušťku, různou nasáklost a různou aktivitu.</w:t>
+      </w:r>
+    </w:p>
+    <w:p>
+      <w:pPr/>
+      <w:r>
+        <w:t xml:space="preserve">Placka není hlavní motor fermentace. Hlavní síla je aktivní kyselý startér. Placka je pouze doplňkový faktor, který může mírně pomoct aktivitě kultury a zabírá část objemu nádoby, ale nikdy nesmí zachránit špatný poměr startéru.</w:t>
+      </w:r>
+    </w:p>
+    <w:p>
+      <w:pPr>
+        <w:pStyle w:val="Heading2"/>
+      </w:pPr>
+      <w:r>
+        <w:t xml:space="preserve">Typy placky</w:t>
+      </w:r>
+    </w:p>
+    <w:p>
+      <w:pPr/>
+      <w:r>
+        <w:t xml:space="preserve">tenká medůzka: orientační mokrá gramáž cca 15-50 g, default pro výpočet 30 g, síla v modelu 0,5 bodu.</w:t>
+      </w:r>
+    </w:p>
+    <w:p>
+      <w:pPr/>
+      <w:r>
+        <w:t xml:space="preserve">akorát do dlaně: orientační mokrá gramáž cca 50-120 g, default pro výpočet 80 g, síla v modelu 1 bod.</w:t>
+      </w:r>
+    </w:p>
+    <w:p>
+      <w:pPr/>
+      <w:r>
+        <w:t xml:space="preserve">klasická palačinka: orientační mokrá gramáž cca 120-250 g, default pro výpočet 180 g, síla v modelu 1,5 bodu.</w:t>
+      </w:r>
+    </w:p>
+    <w:p>
+      <w:pPr/>
+      <w:r>
+        <w:t xml:space="preserve">kolo od traktoru: orientační mokrá gramáž cca 250-600+ g, default pro výpočet 350 g, síla v modelu 2 body.</w:t>
+      </w:r>
+    </w:p>
+    <w:p>
+      <w:pPr/>
+      <w:r>
+        <w:t xml:space="preserve">V UI zobrazovat hodnoty jako orientační, například: cca 120-250 g mokré placky, pro výpočet počítáme 180 g. Nesmí se zobrazovat jako přesná laboratorní hodnota.</w:t>
+      </w:r>
+    </w:p>
+    <w:p>
+      <w:pPr>
+        <w:pStyle w:val="Heading2"/>
+      </w:pPr>
+      <w:r>
+        <w:t xml:space="preserve">Přesná gramáž placky</w:t>
+      </w:r>
+    </w:p>
+    <w:p>
+      <w:pPr/>
+      <w:r>
+        <w:t xml:space="preserve">Uživatel může místo výběru velikosti zadat přesnou gramáž placky. Pokud zadá přesnou gramáž, aplikace ji převede na sílu placky takto: 0-50 g = 0,5 bodu; 51-120 g = 1 bod; 121-250 g = 1,5 bodu; 251 g a víc = 2 body.</w:t>
+      </w:r>
+    </w:p>
+    <w:p>
+      <w:pPr/>
+      <w:r>
+        <w:t xml:space="preserve">Maximální síla jedné placky je 2 body. Ani velmi těžká placka nesmí mít vyšší vliv, protože velká placka neznamená automaticky silnější fermentaci.</w:t>
+      </w:r>
+    </w:p>
+    <w:p>
+      <w:pPr>
+        <w:pStyle w:val="Heading2"/>
+      </w:pPr>
+      <w:r>
+        <w:t xml:space="preserve">Počet placek</w:t>
+      </w:r>
+    </w:p>
+    <w:p>
+      <w:pPr/>
+      <w:r>
+        <w:t xml:space="preserve">Pokud uživatel zadá počet placek, síla se násobí počtem: síla_placky = body_za_velikost x počet_placek. Příklad: 1x klasická palačinka = 1,5 bodu; 2x klasická palačinka = 3 body; 1x tenká medůzka = 0,5 bodu.</w:t>
+      </w:r>
+    </w:p>
+    <w:p>
+      <w:pPr/>
+      <w:r>
+        <w:t xml:space="preserve">Ani vysoké skóre placky nesmí přebít nízké množství nebo slabou kvalitu startéru.</w:t>
+      </w:r>
+    </w:p>
+    <w:p>
+      <w:pPr>
+        <w:pStyle w:val="Heading2"/>
+      </w:pPr>
+      <w:r>
+        <w:t xml:space="preserve">Pravidlo placka vs. startér</w:t>
+      </w:r>
+    </w:p>
+    <w:p>
+      <w:pPr/>
+      <w:r>
+        <w:t xml:space="preserve">Placka nikdy nesmí změnit výsledek ze STOP na OK, z červeného varování na OK, ani z rizikového startu na bezpečný start.</w:t>
+      </w:r>
+    </w:p>
+    <w:p>
+      <w:pPr/>
+      <w:r>
+        <w:t xml:space="preserve">Může změnit maximálně jemné hodnocení v rámci doporučení, například: velmi slabé -&gt; pořád slabé, ale s drobnou podporou; hraniční -&gt; hraniční, ale placka trochu pomůže. Pokud je startér pod kritickým minimem, aplikace musí dál hlásit problém se startérem.</w:t>
+      </w:r>
+    </w:p>
+    <w:p>
+      <w:pPr/>
+      <w:r>
+        <w:t xml:space="preserve">Modelový příklad: uživatel chce vyrobit 9,6 l kombuchy, má 300 ml slabého startéru, černý čaj a 1 placku velikosti palačinka. starter_ratio = 300 / 9600 = 3,1 %. Slabý startér vyžaduje cca 15-20 % pracovního objemu. 1x palačinka = cca 180 g = 1,5 bodu. Verdikt: černý čaj je v pořádku a placka trochu pomůže, ale startér je zásadně pod minimem. Jedna palačinka skoro desetilitrovou várku nezachrání.</w:t>
+      </w:r>
+    </w:p>
+    <w:p>
+      <w:pPr/>
+      <w:r>
+        <w:t xml:space="preserve">Výstup: Na tenhle objem máš moc málo slabého startéru. Kultura se pravděpodobně rozředí, fermentace pojede pomalu a sladký čaj bude dlouho málo kyselý. Placka pomůže jen trochu, ale problém je množství a síla startéru.</w:t>
+      </w:r>
+    </w:p>
+    <w:p>
+      <w:pPr/>
+      <w:r>
+        <w:t xml:space="preserve">Doporučení: Zmenši várku na cca 1,5-2 l, nebo přidej startér na cca 1,4-1,9 l.</w:t>
+      </w:r>
+    </w:p>
+    <w:p>
+      <w:pPr>
+        <w:pStyle w:val="Heading2"/>
+      </w:pPr>
+      <w:r>
+        <w:t xml:space="preserve">Mikrocopy do UI</w:t>
+      </w:r>
+    </w:p>
+    <w:p>
+      <w:pPr/>
+      <w:r>
+        <w:t xml:space="preserve">K velikosti placky: Ber to orientačně. Placka může být tenká blána nebo nacucaná deka.</w:t>
+      </w:r>
+    </w:p>
+    <w:p>
+      <w:pPr/>
+      <w:r>
+        <w:t xml:space="preserve">K přesné gramáži: Zvážená placka je přesnější než naše kombuchová zoologie.</w:t>
+      </w:r>
+    </w:p>
+    <w:p>
+      <w:pPr/>
+      <w:r>
+        <w:t xml:space="preserve">K velké placce: Obří placka vypadá impozantně, ale startér za ni práci neodmaká.</w:t>
+      </w:r>
+    </w:p>
+    <w:p>
+      <w:pPr/>
+      <w:r>
+        <w:t xml:space="preserve">K malé placce: Malá placka nevadí, když máš dost silného startéru.</w:t>
+      </w:r>
+    </w:p>
+    <w:p>
+      <w:pPr/>
+      <w:r>
+        <w:t xml:space="preserve">K rizikovému startu: Placka je fajn parťák, ale hlavní motor je kyselý startér.</w:t>
+      </w:r>
+    </w:p>
+    <w:p>
+      <w:pPr>
+        <w:pStyle w:val="Heading2"/>
+      </w:pPr>
+      <w:r>
+        <w:t xml:space="preserve">Implementační poznámka</w:t>
+      </w:r>
+    </w:p>
+    <w:p>
+      <w:pPr/>
+      <w:r>
+        <w:t xml:space="preserve">Placka má v modelu ovlivňovat pouze doplňkové skóre, například pellicle_bonus_score. Nemá přímo navyšovat starter_ratio. Startér je kapalina a jeho podíl v pracovním objemu musí zůstat samostatný ukazatel.</w:t>
+      </w:r>
+    </w:p>
+    <w:p>
+      <w:pPr/>
+      <w:r>
+        <w:t xml:space="preserve">Správně: starter_ratio = starter_ml / pracovní_objem_ml; pellicle_bonus_score = velikost_placky_body x počet_placek.</w:t>
+      </w:r>
+    </w:p>
+    <w:p>
+      <w:pPr/>
+      <w:r>
+        <w:t xml:space="preserve">Špatně: nepřepočítávat placku jako náhradu startéru; neříkat, že 180g placka nahradí například 300 ml startéru.</w:t>
+      </w:r>
+    </w:p>
+    <w:p>
+      <w:pPr/>
+      <w:r>
+        <w:t xml:space="preserve">Výstup predikce musí vždy jasně oddělit: co je v pořádku; co je problém; co placka může a nemůže zachránit; co má uživatel změnit.</w:t>
+      </w:r>
+    </w:p>
     <w:sectPr>
       <w:pgSz w:w="11906" w:h="16838"/>
       <w:pgMar w:top="1417" w:right="1417" w:bottom="1417" w:left="1417" w:header="708" w:footer="708" w:gutter="0"/>

</xml_diff>

<commit_message>
Improve experiment tea inputs and responsive layout
</commit_message>
<xml_diff>
--- a/🧪 PRD pro Kombuchu.docx
+++ b/🧪 PRD pro Kombuchu.docx
@@ -9652,6 +9652,118 @@
     <w:p>
       <w:r>
         <w:t xml:space="preserve">12. Nikde nepoužívej formulace „já bych“, „doporučila bych“, „za mě“, „podle mě“.</w:t>
+      </w:r>
+    </w:p>
+    <w:p>
+      <w:pPr>
+        <w:pStyle w:val="Heading1"/>
+      </w:pPr>
+      <w:r>
+        <w:rPr>
+          <w:b/>
+        </w:rPr>
+        <w:t>27. Experimentální laboratoř: editovatelná voda u čajů</w:t>
+      </w:r>
+    </w:p>
+    <w:p>
+      <w:pPr/>
+      <w:r>
+        <w:t>V Experimentální laboratoři je pole „Voda v litrech“ editovatelné. Uživatel může u každého aktivního čaje zadat typ čaje, poměr %, vodu v litrech, množství g/l a celkem gramů čaje.</w:t>
+      </w:r>
+    </w:p>
+    <w:p>
+      <w:pPr/>
+      <w:r>
+        <w:t>Klasická kalkulačka zůstává beze změny: uživatel jen vybírá čaje a Kombuchátor automaticky doporučí poměry, objemy vody i gramáž. V klasice uživatel nemusí řešit litry ani procenta u jednotlivých čajů.</w:t>
+      </w:r>
+    </w:p>
+    <w:p>
+      <w:pPr/>
+      <w:r>
+        <w:t>V Experimentální laboratoři jsou propojené hodnoty poměr % a voda v litrech. Když uživatel naposledy upraví poměr, voda se dopočítá podle freshTeaL = pracovní_objem_l - starter_l. Když uživatel naposledy upraví vodu, poměr se dopočítá podle skutečně zadané vody: tea.ratio = tea.waterMl / totalTeaWaterMl × 100.</w:t>
+      </w:r>
+    </w:p>
+    <w:p>
+      <w:pPr/>
+      <w:r>
+        <w:t>Každý čaj nese lastEditedTeaField: ratio, water, grams nebo totalGrams. Aplikace nesmí uživateli bojovat pod rukama: dopočítává vždy opačnou hodnotu podle toho, co uživatel upravil naposledy.</w:t>
+      </w:r>
+    </w:p>
+    <w:p>
+      <w:pPr/>
+      <w:r>
+        <w:t>Když uživatel zadá vodu jen u některých aktivních čajů, zadané hodnoty zůstanou zachované a zbývající voda se rozdělí mezi prázdné čaje. Pokud mají prázdné čaje poměry, použijí se jako váhy. Pokud poměry nemají, zbytek se rozdělí rovnoměrně. Pokud je zadané vody víc, než se vejde, prázdné čaje dostanou 0 l a zobrazí se varování o přebytku.</w:t>
+      </w:r>
+    </w:p>
+    <w:p>
+      <w:pPr/>
+      <w:r>
+        <w:t>Aplikace porovnává freshTeaL a enteredTeaWaterL. Pokud rozdíl přesáhne cca 0,1 l směrem dolů, zobraz: „Máš zadaného méně čajového nálevu, než odpovídá plánované várce. Buď doplň vodu u čajů, nebo zmenši cílový objem.“ Doplň konkrétně: „Do plánované várky ti chybí cca X l čajového nálevu.“</w:t>
+      </w:r>
+    </w:p>
+    <w:p>
+      <w:pPr/>
+      <w:r>
+        <w:t>Pokud rozdíl přesáhne cca 0,1 l směrem nahoru, zobraz: „Máš zadaného víc čajového nálevu, než se do plánované várky vejde. Uber vodu u čajů, zmenši startér, nebo zvětši plánovaný objem.“ Doplň konkrétně: „Přebývá ti cca X l čajového nálevu.“ Rozdíl do cca 0,1 l ber jako v pořádku.</w:t>
+      </w:r>
+    </w:p>
+    <w:p>
+      <w:pPr/>
+      <w:r>
+        <w:t>Gramáž čaje se přepočítává obousměrně. teaTotalGrams = teaWaterL × teaGramsPerLiter. Když uživatel upraví g/l, přepočítá se celkem g. Když upraví celkem g, přepočítá se g/l podle vody. Pokud voda u čaje není zadaná nebo je 0, nepočítej g/l z celkových gramů a zobraz: „Nejdřív zadej vodu u čaje, ať můžu přepočítat gramáž.“</w:t>
+      </w:r>
+    </w:p>
+    <w:p>
+      <w:pPr/>
+      <w:r>
+        <w:t>Hláška pod čajovou sekcí musí spojit vhodnost čajového základu pro F1, sílu nálevu podle avgTeaStrength, dopad na chuť a konkrétní akci. Méně než 4 g/l znamená slabý nálev, 4–7 g/l akorát, 7–9 g/l silný, více než 9 g/l extrémně silný. Zelený nebo bílý čaj nad 7 g/l má speciální varování o hořkosti a je důležitější než obecná hláška o silném čaji.</w:t>
+      </w:r>
+    </w:p>
+    <w:p>
+      <w:pPr>
+        <w:pStyle w:val="Heading1"/>
+      </w:pPr>
+      <w:r>
+        <w:rPr>
+          <w:b/>
+        </w:rPr>
+        <w:t>28. Responzivita a adaptivní zobrazení</w:t>
+      </w:r>
+    </w:p>
+    <w:p>
+      <w:pPr/>
+      <w:r>
+        <w:t>Aplikace musí být použitelná na desktopu, tabletu i mobilu. Layout je adaptivní podle šířky obrazovky. Ovládací prvky se nesmí překrývat, texty nesmí přetékat mimo boxy a formulářová pole musí zůstat čitelná a ovladatelná i na menších displejích.</w:t>
+      </w:r>
+    </w:p>
+    <w:p>
+      <w:pPr/>
+      <w:r>
+        <w:t>Desktop je primární kompozice: levý sidebar, horní header, hlavní grid karet a pravý výsledkový sloupec s předpovědí a poznámkou „Budeš potřebovat“.</w:t>
+      </w:r>
+    </w:p>
+    <w:p>
+      <w:pPr/>
+      <w:r>
+        <w:t>Tabletové zobrazení skládá pravý výsledkový panel pod hlavní kalkulačku dřív, než by se karty nebo vstupy začaly mačkat. Vstupní karty se mohou skládat do jednoho sloupce, ale pořadí sekcí a všechny funkce zůstávají stejné.</w:t>
+      </w:r>
+    </w:p>
+    <w:p>
+      <w:pPr/>
+      <w:r>
+        <w:t>Mobilní zobrazení převádí sidebar do kompaktní horní navigace, hlavní obsah do jednoho sloupce a vnitřní gridy formulářů skládá pod sebe. Karty, výsledkový panel i poznámkový lístek zůstávají čitelné a nesmí vytvářet horizontální přetečení stránky.</w:t>
+      </w:r>
+    </w:p>
+    <w:p>
+      <w:pPr/>
+      <w:r>
+        <w:t>Čajová tabulka v Experimentální laboratoři se na mobilu nesmí rozbít. Řádky čajů se přepnou do stacked layoutu: typ čaje zůstane nahoře a pole poměr %, voda, množství g/l a celkem g se zobrazí pod sebou s jasnými popisky.</w:t>
+      </w:r>
+    </w:p>
+    <w:p>
+      <w:pPr/>
+      <w:r>
+        <w:t>Responzivitu ověřuj minimálně na šířkách 390 px, 768 px, 1024 px a 1440 px. Acceptance: žádné inputy, selecty, buttony, hlášky ani výsledkové boxy se nepřekrývají; texty jsou čitelné; ovládání zůstává dostupné; klasická kalkulačka i Experimentální laboratoř zachovávají stávající logiku.</w:t>
       </w:r>
     </w:p>
     <w:sectPr>

</xml_diff>

<commit_message>
Replace recipe note pin asset
</commit_message>
<xml_diff>
--- a/🧪 PRD pro Kombuchu.docx
+++ b/🧪 PRD pro Kombuchu.docx
@@ -9764,6 +9764,11 @@
       <w:pPr/>
       <w:r>
         <w:t>Responzivitu ověřuj minimálně na šířkách 390 px, 768 px, 1024 px a 1440 px. Acceptance: žádné inputy, selecty, buttony, hlášky ani výsledkové boxy se nepřekrývají; texty jsou čitelné; ovládání zůstává dostupné; klasická kalkulačka i Experimentální laboratoř zachovávají stávající logiku.</w:t>
+      </w:r>
+    </w:p>
+    <w:p>
+      <w:r>
+        <w:t>UI detail: Poznámkový lístek „Budeš potřebovat“ používá lokální transparentní pushpin asset místo inline kresleného špendlíku. Pin je dekorativní, nesmí překrývat obsah lístku a musí zůstat čitelný na mobilu i desktopu.</w:t>
       </w:r>
     </w:p>
     <w:sectPr>

</xml_diff>

<commit_message>
Prefer Intro Rust for brand title
</commit_message>
<xml_diff>
--- a/🧪 PRD pro Kombuchu.docx
+++ b/🧪 PRD pro Kombuchu.docx
@@ -9769,6 +9769,11 @@
     <w:p>
       <w:r>
         <w:t>UI detail: Poznámkový lístek „Budeš potřebovat“ používá lokální transparentní pushpin asset místo inline kresleného špendlíku. Pin je dekorativní, nesmí překrývat obsah lístku a musí zůstat čitelný na mobilu i desktopu.</w:t>
+      </w:r>
+    </w:p>
+    <w:p>
+      <w:r>
+        <w:t>Typografie: Nadpis „Kombuchátor“ preferuje font Intro Rust / Intro Rust Base, pokud je dostupný jako webfont nebo systémový font. Pokud není font dodaný v projektu, použije se fallback DM Sans, aby zůstala zachovaná čitelnost a diakritika.</w:t>
       </w:r>
     </w:p>
     <w:sectPr>

</xml_diff>

<commit_message>
Add saved recipes and sharing
</commit_message>
<xml_diff>
--- a/🧪 PRD pro Kombuchu.docx
+++ b/🧪 PRD pro Kombuchu.docx
@@ -9774,6 +9774,83 @@
     <w:p>
       <w:r>
         <w:t>Typografie: Nadpis „Kombuchátor“ preferuje font Intro Rust / Intro Rust Base, pokud je dostupný jako webfont nebo systémový font. Pokud není font dodaný v projektu, použije se fallback DM Sans, aby zůstala zachovaná čitelnost a diakritika.</w:t>
+      </w:r>
+    </w:p>
+    <w:p>
+      <w:pPr>
+        <w:pStyle w:val="Heading1"/>
+      </w:pPr>
+      <w:r>
+        <w:rPr>
+          <w:b/>
+        </w:rPr>
+        <w:t>29. Ukládání a sdílení receptů</w:t>
+      </w:r>
+    </w:p>
+    <w:p>
+      <w:pPr/>
+      <w:r>
+        <w:t>Kombuchátor umožňuje uložit aktuálně vypočítaný recept z Klasické kalkulačky i režimu Hokus pokus jako snapshot. Uložený recept se po uložení dál nemění, i když uživatel pokračuje v úpravách kalkulačky.</w:t>
+      </w:r>
+    </w:p>
+    <w:p>
+      <w:pPr/>
+      <w:r>
+        <w:t>U hlavního výsledkového panelu jsou akce: Uložit recept, WhatsApp, Messenger a Kopírovat text. Akce jsou vypnuté, pokud chybí povinné údaje. STOP a rizikový recept lze uložit jako varování, ale musí být jasně označený a nesmí působit jako běžný doporučený recept.</w:t>
+      </w:r>
+    </w:p>
+    <w:p>
+      <w:pPr/>
+      <w:r>
+        <w:t>Při kliknutí na Uložit recept se otevře dialog „Jak si chceš recept pojmenovat?“ s předvyplněným automatickým názvem podle cíle a množství. Pokud uživatel nechá název prázdný, použije se automatický název. Po uložení se zobrazí hláška „Recept máš uložený.“</w:t>
+      </w:r>
+    </w:p>
+    <w:p>
+      <w:pPr/>
+      <w:r>
+        <w:t>Uložený recept obsahuje id, datum a čas, recipeName, defaultRecipeName, režim, cíl, objemy, startér, starter_ratio, čaje, cukr, placku, teplotu, stav, verdikt, chuťovou predikci, doporučení fermentace, F2 štítek, sdílecí text a userNote.</w:t>
+      </w:r>
+    </w:p>
+    <w:p>
+      <w:pPr/>
+      <w:r>
+        <w:t>Sekce „Uložené recepty“ je pod kalkulačkou. Má podtitulek „Tady si necháš recepty, které chceš zopakovat, doladit nebo poslat dál.“ Empty state: „Kombuchový zápisník je zatím prázdný. Ulož první recept a začne to tu žít.“</w:t>
+      </w:r>
+    </w:p>
+    <w:p>
+      <w:pPr/>
+      <w:r>
+        <w:t>Každý uložený recept se zobrazuje jako papírová karta se jménem receptu, datem uložení, badge režimu, badge stavu, krátkým shrnutím, verdiktem, sdílecím textem, poznámkou a akcemi WhatsApp, Messenger, Kopírovat text a Smazat recept.</w:t>
+      </w:r>
+    </w:p>
+    <w:p>
+      <w:pPr/>
+      <w:r>
+        <w:t>Název uloženého receptu lze upravit přímo v kartě přes ikonu tužky. Uložit lze Enterem, kliknutím mimo input nebo tlačítkem „Uložit název“. Po uložení se zobrazí „Název uložený.“ Karta nesmí zůstat bez názvu.</w:t>
+      </w:r>
+    </w:p>
+    <w:p>
+      <w:pPr/>
+      <w:r>
+        <w:t>Poznámka se edituje přímo v kartě a ukládá se automaticky do localStorage. Placeholder: „Co si k tomu chceš poznamenat? Třeba chuť, datum stáčení, bublinky nebo co příště změnit…“ Po uložení poznámky se zobrazí „Poznámka uložená.“</w:t>
+      </w:r>
+    </w:p>
+    <w:p>
+      <w:pPr/>
+      <w:r>
+        <w:t>WhatsApp používá sdílecí URL s URL encoded textem. Messenger má fallback přes kopírování do schránky a hlášku „Text máš zkopírovaný. Teď ho vlož do Messengeru.“ Kopírování textu zobrazí „Zkopírováno. Teď to můžeš poslat, kam chceš.“</w:t>
+      </w:r>
+    </w:p>
+    <w:p>
+      <w:pPr/>
+      <w:r>
+        <w:t>Recepty se pro MVP ukládají pouze do localStorage v aktuálním prohlížeči. UI obsahuje poznámku: „Zápisník si pamatuje recepty jen tady v prohlížeči. Když přijdeš z jiného zařízení, nemusí tu být.“ Cloud sync ani účty nejsou součást MVP.</w:t>
+      </w:r>
+    </w:p>
+    <w:p>
+      <w:pPr/>
+      <w:r>
+        <w:t>Uložené recepty se řadí od nejnovějšího po nejstarší a nahoře se zobrazuje počet „Uložené recepty: X“. Sdílený text vždy používá aktuální recipeName včetně změn provedených v kartě.</w:t>
       </w:r>
     </w:p>
     <w:sectPr>

</xml_diff>